<commit_message>
Update report for redesigned chat UI
</commit_message>
<xml_diff>
--- a/docs/reports/Bao_cao_thuc_hanh_Chat_Messaging_System.docx
+++ b/docs/reports/Bao_cao_thuc_hanh_Chat_Messaging_System.docx
@@ -894,7 +894,7 @@
             <w:u w:val="none"/>
             <w:color w:val="000000"/>
           </w:rPr>
-          <w:t>26</w:t>
+          <w:t>27</w:t>
         </w:r>
       </w:hyperlink>
     </w:p>
@@ -932,7 +932,7 @@
             <w:u w:val="none"/>
             <w:color w:val="000000"/>
           </w:rPr>
-          <w:t>27</w:t>
+          <w:t>28</w:t>
         </w:r>
       </w:hyperlink>
     </w:p>
@@ -1617,7 +1617,7 @@
             <w:u w:val="none"/>
             <w:color w:val="000000"/>
           </w:rPr>
-          <w:t xml:space="preserve">Hình 9.1 Giao diện ứng dụng chat hiển thị trên trình duyệt</w:t>
+          <w:t xml:space="preserve">Hình 9.1 Giao diện chat sau nâng cấp CSS, bố cục hai cột</w:t>
         </w:r>
         <w:r>
           <w:rPr>
@@ -1635,7 +1635,7 @@
             <w:u w:val="none"/>
             <w:color w:val="000000"/>
           </w:rPr>
-          <w:t>20</w:t>
+          <w:t>21</w:t>
         </w:r>
       </w:hyperlink>
     </w:p>
@@ -1673,7 +1673,7 @@
             <w:u w:val="none"/>
             <w:color w:val="000000"/>
           </w:rPr>
-          <w:t>20</w:t>
+          <w:t>21</w:t>
         </w:r>
       </w:hyperlink>
     </w:p>
@@ -1711,7 +1711,7 @@
             <w:u w:val="none"/>
             <w:color w:val="000000"/>
           </w:rPr>
-          <w:t>21</w:t>
+          <w:t>22</w:t>
         </w:r>
       </w:hyperlink>
     </w:p>
@@ -3108,7 +3108,7 @@
             <w:u w:val="none"/>
             <w:color w:val="000000"/>
           </w:rPr>
-          <w:t>25</w:t>
+          <w:t>26</w:t>
         </w:r>
       </w:hyperlink>
     </w:p>
@@ -3147,7 +3147,7 @@
             <w:u w:val="none"/>
             <w:color w:val="000000"/>
           </w:rPr>
-          <w:t>25</w:t>
+          <w:t>26</w:t>
         </w:r>
       </w:hyperlink>
     </w:p>
@@ -3186,7 +3186,7 @@
             <w:u w:val="none"/>
             <w:color w:val="000000"/>
           </w:rPr>
-          <w:t>25</w:t>
+          <w:t>26</w:t>
         </w:r>
       </w:hyperlink>
     </w:p>
@@ -3225,7 +3225,7 @@
             <w:u w:val="none"/>
             <w:color w:val="000000"/>
           </w:rPr>
-          <w:t>25</w:t>
+          <w:t>26</w:t>
         </w:r>
       </w:hyperlink>
     </w:p>
@@ -3264,7 +3264,7 @@
             <w:u w:val="none"/>
             <w:color w:val="000000"/>
           </w:rPr>
-          <w:t>25</w:t>
+          <w:t>26</w:t>
         </w:r>
       </w:hyperlink>
     </w:p>
@@ -3303,7 +3303,7 @@
             <w:u w:val="none"/>
             <w:color w:val="000000"/>
           </w:rPr>
-          <w:t>25</w:t>
+          <w:t>26</w:t>
         </w:r>
       </w:hyperlink>
     </w:p>
@@ -3343,7 +3343,7 @@
             <w:u w:val="none"/>
             <w:color w:val="000000"/>
           </w:rPr>
-          <w:t>25</w:t>
+          <w:t>26</w:t>
         </w:r>
       </w:hyperlink>
     </w:p>
@@ -3382,7 +3382,7 @@
             <w:u w:val="none"/>
             <w:color w:val="000000"/>
           </w:rPr>
-          <w:t>25</w:t>
+          <w:t>26</w:t>
         </w:r>
       </w:hyperlink>
     </w:p>
@@ -3421,7 +3421,7 @@
             <w:u w:val="none"/>
             <w:color w:val="000000"/>
           </w:rPr>
-          <w:t>25</w:t>
+          <w:t>27</w:t>
         </w:r>
       </w:hyperlink>
     </w:p>
@@ -3460,7 +3460,7 @@
             <w:u w:val="none"/>
             <w:color w:val="000000"/>
           </w:rPr>
-          <w:t>26</w:t>
+          <w:t>27</w:t>
         </w:r>
       </w:hyperlink>
     </w:p>
@@ -3500,7 +3500,7 @@
             <w:u w:val="none"/>
             <w:color w:val="000000"/>
           </w:rPr>
-          <w:t>26</w:t>
+          <w:t>27</w:t>
         </w:r>
       </w:hyperlink>
     </w:p>
@@ -3539,7 +3539,7 @@
             <w:u w:val="none"/>
             <w:color w:val="000000"/>
           </w:rPr>
-          <w:t>26</w:t>
+          <w:t>27</w:t>
         </w:r>
       </w:hyperlink>
     </w:p>
@@ -3578,7 +3578,7 @@
             <w:u w:val="none"/>
             <w:color w:val="000000"/>
           </w:rPr>
-          <w:t>27</w:t>
+          <w:t>28</w:t>
         </w:r>
       </w:hyperlink>
     </w:p>
@@ -3617,7 +3617,7 @@
             <w:u w:val="none"/>
             <w:color w:val="000000"/>
           </w:rPr>
-          <w:t>27</w:t>
+          <w:t>28</w:t>
         </w:r>
       </w:hyperlink>
     </w:p>
@@ -26120,227 +26120,13 @@
     </w:p>
     <w:p>
       <w:pPr>
+        <w:keepNext/>
+        <w:keepLines/>
         <w:spacing w:after="120" w:line="360" w:lineRule="auto"/>
         <w:jc w:val="both"/>
       </w:pPr>
       <w:r>
-        <w:t xml:space="preserve">Các </w:t>
-      </w:r>
-      <w:proofErr w:type="spellStart"/>
-      <w:r>
-        <w:t>chức</w:t>
-      </w:r>
-      <w:proofErr w:type="spellEnd"/>
-      <w:r>
-        <w:t xml:space="preserve"> </w:t>
-      </w:r>
-      <w:proofErr w:type="spellStart"/>
-      <w:r>
-        <w:t>năng</w:t>
-      </w:r>
-      <w:proofErr w:type="spellEnd"/>
-      <w:r>
-        <w:t xml:space="preserve"> </w:t>
-      </w:r>
-      <w:proofErr w:type="spellStart"/>
-      <w:r>
-        <w:t>cốt</w:t>
-      </w:r>
-      <w:proofErr w:type="spellEnd"/>
-      <w:r>
-        <w:t xml:space="preserve"> </w:t>
-      </w:r>
-      <w:proofErr w:type="spellStart"/>
-      <w:r>
-        <w:t>lõi</w:t>
-      </w:r>
-      <w:proofErr w:type="spellEnd"/>
-      <w:r>
-        <w:t xml:space="preserve"> </w:t>
-      </w:r>
-      <w:proofErr w:type="spellStart"/>
-      <w:r>
-        <w:t>đã</w:t>
-      </w:r>
-      <w:proofErr w:type="spellEnd"/>
-      <w:r>
-        <w:t xml:space="preserve"> </w:t>
-      </w:r>
-      <w:proofErr w:type="spellStart"/>
-      <w:r>
-        <w:t>chứng</w:t>
-      </w:r>
-      <w:proofErr w:type="spellEnd"/>
-      <w:r>
-        <w:t xml:space="preserve"> </w:t>
-      </w:r>
-      <w:proofErr w:type="spellStart"/>
-      <w:r>
-        <w:t>minh</w:t>
-      </w:r>
-      <w:proofErr w:type="spellEnd"/>
-      <w:r>
-        <w:t xml:space="preserve"> </w:t>
-      </w:r>
-      <w:proofErr w:type="spellStart"/>
-      <w:r>
-        <w:t>được</w:t>
-      </w:r>
-      <w:proofErr w:type="spellEnd"/>
-      <w:r>
-        <w:t xml:space="preserve"> </w:t>
-      </w:r>
-      <w:proofErr w:type="spellStart"/>
-      <w:r>
-        <w:t>việc</w:t>
-      </w:r>
-      <w:proofErr w:type="spellEnd"/>
-      <w:r>
-        <w:t xml:space="preserve"> </w:t>
-      </w:r>
-      <w:proofErr w:type="spellStart"/>
-      <w:r>
-        <w:t>tạo</w:t>
-      </w:r>
-      <w:proofErr w:type="spellEnd"/>
-      <w:r>
-        <w:t xml:space="preserve"> </w:t>
-      </w:r>
-      <w:proofErr w:type="spellStart"/>
-      <w:r>
-        <w:t>phòng</w:t>
-      </w:r>
-      <w:proofErr w:type="spellEnd"/>
-      <w:r>
-        <w:t xml:space="preserve">, </w:t>
-      </w:r>
-      <w:proofErr w:type="spellStart"/>
-      <w:r>
-        <w:t>gửi</w:t>
-      </w:r>
-      <w:proofErr w:type="spellEnd"/>
-      <w:r>
-        <w:t xml:space="preserve"> </w:t>
-      </w:r>
-      <w:proofErr w:type="spellStart"/>
-      <w:r>
-        <w:t>và</w:t>
-      </w:r>
-      <w:proofErr w:type="spellEnd"/>
-      <w:r>
-        <w:t xml:space="preserve"> </w:t>
-      </w:r>
-      <w:proofErr w:type="spellStart"/>
-      <w:r>
-        <w:t>lưu</w:t>
-      </w:r>
-      <w:proofErr w:type="spellEnd"/>
-      <w:r>
-        <w:t xml:space="preserve"> tin </w:t>
-      </w:r>
-      <w:proofErr w:type="spellStart"/>
-      <w:r>
-        <w:t>nhắn</w:t>
-      </w:r>
-      <w:proofErr w:type="spellEnd"/>
-      <w:r>
-        <w:t xml:space="preserve">, </w:t>
-      </w:r>
-      <w:proofErr w:type="spellStart"/>
-      <w:r>
-        <w:t>đọc</w:t>
-      </w:r>
-      <w:proofErr w:type="spellEnd"/>
-      <w:r>
-        <w:t xml:space="preserve"> </w:t>
-      </w:r>
-      <w:proofErr w:type="spellStart"/>
-      <w:r>
-        <w:t>lịch</w:t>
-      </w:r>
-      <w:proofErr w:type="spellEnd"/>
-      <w:r>
-        <w:t xml:space="preserve"> </w:t>
-      </w:r>
-      <w:proofErr w:type="spellStart"/>
-      <w:r>
-        <w:t>sử</w:t>
-      </w:r>
-      <w:proofErr w:type="spellEnd"/>
-      <w:r>
-        <w:t xml:space="preserve"> </w:t>
-      </w:r>
-      <w:proofErr w:type="spellStart"/>
-      <w:r>
-        <w:t>từ</w:t>
-      </w:r>
-      <w:proofErr w:type="spellEnd"/>
-      <w:r>
-        <w:t xml:space="preserve"> PostgreSQL </w:t>
-      </w:r>
-      <w:proofErr w:type="spellStart"/>
-      <w:r>
-        <w:t>và</w:t>
-      </w:r>
-      <w:proofErr w:type="spellEnd"/>
-      <w:r>
-        <w:t xml:space="preserve"> </w:t>
-      </w:r>
-      <w:proofErr w:type="spellStart"/>
-      <w:r>
-        <w:t>trao</w:t>
-      </w:r>
-      <w:proofErr w:type="spellEnd"/>
-      <w:r>
-        <w:t xml:space="preserve"> </w:t>
-      </w:r>
-      <w:proofErr w:type="spellStart"/>
-      <w:r>
-        <w:t>đổi</w:t>
-      </w:r>
-      <w:proofErr w:type="spellEnd"/>
-      <w:r>
-        <w:t xml:space="preserve"> </w:t>
-      </w:r>
-      <w:proofErr w:type="spellStart"/>
-      <w:r>
-        <w:t>thời</w:t>
-      </w:r>
-      <w:proofErr w:type="spellEnd"/>
-      <w:r>
-        <w:t xml:space="preserve"> </w:t>
-      </w:r>
-      <w:proofErr w:type="spellStart"/>
-      <w:r>
-        <w:t>gian</w:t>
-      </w:r>
-      <w:proofErr w:type="spellEnd"/>
-      <w:r>
-        <w:t xml:space="preserve"> </w:t>
-      </w:r>
-      <w:proofErr w:type="spellStart"/>
-      <w:r>
-        <w:t>thực</w:t>
-      </w:r>
-      <w:proofErr w:type="spellEnd"/>
-      <w:r>
-        <w:t xml:space="preserve"> </w:t>
-      </w:r>
-      <w:proofErr w:type="spellStart"/>
-      <w:r>
-        <w:t>mượt</w:t>
-      </w:r>
-      <w:proofErr w:type="spellEnd"/>
-      <w:r>
-        <w:t xml:space="preserve"> </w:t>
-      </w:r>
-      <w:proofErr w:type="spellStart"/>
-      <w:r>
-        <w:t>mà</w:t>
-      </w:r>
-      <w:proofErr w:type="spellEnd"/>
-      <w:r>
-        <w:t xml:space="preserve"> qua Socket.IO:</w:t>
+        <w:t>Các chức năng cốt lõi đã được kiểm chứng gồm tạo phòng, gửi và lưu tin nhắn, đọc lại lịch sử từ PostgreSQL và trao đổi thời gian thực qua Socket.IO. Sau khi nâng cấp CSS, các thao tác chat giữa hai cửa sổ, tải lại trang để kiểm tra lịch sử, tạo phòng mới và gửi tin nhắn đã được thử lại thành công; thay đổi giao diện không sửa logic nghiệp vụ của ứng dụng.</w:t>
       </w:r>
     </w:p>
     <w:p>
@@ -26356,7 +26142,7 @@
         <w:lastRenderedPageBreak/>
         <w:drawing>
           <wp:inline distT="0" distB="0" distL="0" distR="0" wp14:anchorId="1D77A752" wp14:editId="125AAFFC">
-            <wp:extent cx="5120640" cy="2579008"/>
+            <wp:extent cx="5120640" cy="2404254"/>
             <wp:effectExtent l="0" t="0" r="0" b="0"/>
             <wp:docPr id="19" name="Picture 19"/>
             <wp:cNvGraphicFramePr>
@@ -26378,7 +26164,7 @@
                   <pic:spPr>
                     <a:xfrm>
                       <a:off x="0" y="0"/>
-                      <a:ext cx="5120640" cy="2579008"/>
+                      <a:ext cx="5120640" cy="2404254"/>
                     </a:xfrm>
                     <a:prstGeom prst="rect">
                       <a:avLst/>
@@ -26396,145 +26182,13 @@
         <w:spacing w:before="40" w:after="240"/>
         <w:jc w:val="center"/>
       </w:pPr>
-      <w:bookmarkStart w:id="54" w:name="_Toc_fig_9_1"/>
-      <w:proofErr w:type="spellStart"/>
       <w:r>
         <w:rPr>
           <w:i/>
           <w:sz w:val="22"/>
         </w:rPr>
-        <w:t>Hình</w:t>
-      </w:r>
-      <w:proofErr w:type="spellEnd"/>
-      <w:r>
-        <w:rPr>
-          <w:i/>
-          <w:sz w:val="22"/>
-        </w:rPr>
-        <w:t xml:space="preserve"> 9.1: Giao </w:t>
-      </w:r>
-      <w:proofErr w:type="spellStart"/>
-      <w:r>
-        <w:rPr>
-          <w:i/>
-          <w:sz w:val="22"/>
-        </w:rPr>
-        <w:t>diện</w:t>
-      </w:r>
-      <w:proofErr w:type="spellEnd"/>
-      <w:r>
-        <w:rPr>
-          <w:i/>
-          <w:sz w:val="22"/>
-        </w:rPr>
-        <w:t xml:space="preserve"> </w:t>
-      </w:r>
-      <w:proofErr w:type="spellStart"/>
-      <w:r>
-        <w:rPr>
-          <w:i/>
-          <w:sz w:val="22"/>
-        </w:rPr>
-        <w:t>ứng</w:t>
-      </w:r>
-      <w:proofErr w:type="spellEnd"/>
-      <w:r>
-        <w:rPr>
-          <w:i/>
-          <w:sz w:val="22"/>
-        </w:rPr>
-        <w:t xml:space="preserve"> </w:t>
-      </w:r>
-      <w:proofErr w:type="spellStart"/>
-      <w:r>
-        <w:rPr>
-          <w:i/>
-          <w:sz w:val="22"/>
-        </w:rPr>
-        <w:t>dụng</w:t>
-      </w:r>
-      <w:proofErr w:type="spellEnd"/>
-      <w:r>
-        <w:rPr>
-          <w:i/>
-          <w:sz w:val="22"/>
-        </w:rPr>
-        <w:t xml:space="preserve"> chat </w:t>
-      </w:r>
-      <w:proofErr w:type="spellStart"/>
-      <w:r>
-        <w:rPr>
-          <w:i/>
-          <w:sz w:val="22"/>
-        </w:rPr>
-        <w:t>hiển</w:t>
-      </w:r>
-      <w:proofErr w:type="spellEnd"/>
-      <w:r>
-        <w:rPr>
-          <w:i/>
-          <w:sz w:val="22"/>
-        </w:rPr>
-        <w:t xml:space="preserve"> </w:t>
-      </w:r>
-      <w:proofErr w:type="spellStart"/>
-      <w:r>
-        <w:rPr>
-          <w:i/>
-          <w:sz w:val="22"/>
-        </w:rPr>
-        <w:t>thị</w:t>
-      </w:r>
-      <w:proofErr w:type="spellEnd"/>
-      <w:r>
-        <w:rPr>
-          <w:i/>
-          <w:sz w:val="22"/>
-        </w:rPr>
-        <w:t xml:space="preserve"> </w:t>
-      </w:r>
-      <w:proofErr w:type="spellStart"/>
-      <w:r>
-        <w:rPr>
-          <w:i/>
-          <w:sz w:val="22"/>
-        </w:rPr>
-        <w:t>trên</w:t>
-      </w:r>
-      <w:proofErr w:type="spellEnd"/>
-      <w:r>
-        <w:rPr>
-          <w:i/>
-          <w:sz w:val="22"/>
-        </w:rPr>
-        <w:t xml:space="preserve"> </w:t>
-      </w:r>
-      <w:proofErr w:type="spellStart"/>
-      <w:r>
-        <w:rPr>
-          <w:i/>
-          <w:sz w:val="22"/>
-        </w:rPr>
-        <w:t>trình</w:t>
-      </w:r>
-      <w:proofErr w:type="spellEnd"/>
-      <w:r>
-        <w:rPr>
-          <w:i/>
-          <w:sz w:val="22"/>
-        </w:rPr>
-        <w:t xml:space="preserve"> </w:t>
-      </w:r>
-      <w:proofErr w:type="spellStart"/>
-      <w:r>
-        <w:rPr>
-          <w:i/>
-          <w:sz w:val="22"/>
-        </w:rPr>
-        <w:t>duyệt</w:t>
-      </w:r>
-      <w:bookmarkEnd w:id="54"/>
-      <w:proofErr w:type="spellEnd"/>
+        <w:t>Hình 9.1: Giao diện chat sau nâng cấp CSS, bố cục hai cột</w:t>
+      </w:r>
     </w:p>
     <w:p>
       <w:pPr>
@@ -31522,30 +31176,8 @@
               <w:rPr>
                 <w:sz w:val="22"/>
               </w:rPr>
-              <w:t xml:space="preserve">Giao </w:t>
-            </w:r>
-            <w:proofErr w:type="spellStart"/>
-            <w:r>
-              <w:rPr>
-                <w:sz w:val="22"/>
-              </w:rPr>
-              <w:t>diện</w:t>
-            </w:r>
-            <w:proofErr w:type="spellEnd"/>
-            <w:r>
-              <w:rPr>
-                <w:sz w:val="22"/>
-              </w:rPr>
-              <w:t xml:space="preserve"> web chat </w:t>
-            </w:r>
-            <w:proofErr w:type="spellStart"/>
-            <w:r>
-              <w:rPr>
-                <w:sz w:val="22"/>
-              </w:rPr>
-              <w:t>tĩnh</w:t>
-            </w:r>
-            <w:proofErr w:type="spellEnd"/>
+              <w:t>Giao diện chat ban đầu, lưu làm mốc so sánh trước khi nâng cấp CSS</w:t>
+            </w:r>
           </w:p>
         </w:tc>
         <w:tc>
@@ -31567,7 +31199,7 @@
               <w:rPr>
                 <w:sz w:val="22"/>
               </w:rPr>
-              <w:t>UI</w:t>
+              <w:t>UI ban đầu</w:t>
             </w:r>
           </w:p>
         </w:tc>
@@ -31586,19 +31218,109 @@
             <w:pPr>
               <w:spacing w:before="40" w:after="40" w:line="276" w:lineRule="auto"/>
             </w:pPr>
-            <w:proofErr w:type="spellStart"/>
-            <w:r>
-              <w:rPr>
-                <w:sz w:val="22"/>
-              </w:rPr>
-              <w:t>Hình</w:t>
-            </w:r>
-            <w:proofErr w:type="spellEnd"/>
-            <w:r>
-              <w:rPr>
-                <w:sz w:val="22"/>
-              </w:rPr>
-              <w:t xml:space="preserve"> 9.1</w:t>
+            <w:r>
+              <w:rPr>
+                <w:sz w:val="22"/>
+              </w:rPr>
+              <w:t>Lưu minh chứng</w:t>
+            </w:r>
+          </w:p>
+        </w:tc>
+      </w:tr>
+      <w:tr>
+        <w:trPr>
+          <w:cantSplit/>
+          <w:jc w:val="center"/>
+        </w:trPr>
+        <w:tc>
+          <w:tcPr>
+            <w:tcW w:w="2256" w:type="dxa"/>
+            <w:shd w:val="clear" w:color="auto" w:fill="FAFAFA"/>
+            <w:tcMar>
+              <w:top w:w="120" w:type="dxa"/>
+              <w:left w:w="160" w:type="dxa"/>
+              <w:bottom w:w="120" w:type="dxa"/>
+              <w:right w:w="160" w:type="dxa"/>
+            </w:tcMar>
+          </w:tcPr>
+          <w:p>
+            <w:pPr>
+              <w:spacing w:before="40" w:after="40" w:line="276" w:lineRule="auto"/>
+            </w:pPr>
+            <w:r>
+              <w:rPr>
+                <w:sz w:val="22"/>
+              </w:rPr>
+              <w:t>16_chat_ui_redesign_pass.png</w:t>
+            </w:r>
+          </w:p>
+        </w:tc>
+        <w:tc>
+          <w:tcPr>
+            <w:tcW w:w="2256" w:type="dxa"/>
+            <w:shd w:val="clear" w:color="auto" w:fill="FAFAFA"/>
+            <w:tcMar>
+              <w:top w:w="120" w:type="dxa"/>
+              <w:left w:w="160" w:type="dxa"/>
+              <w:bottom w:w="120" w:type="dxa"/>
+              <w:right w:w="160" w:type="dxa"/>
+            </w:tcMar>
+          </w:tcPr>
+          <w:p>
+            <w:pPr>
+              <w:spacing w:before="40" w:after="40" w:line="276" w:lineRule="auto"/>
+            </w:pPr>
+            <w:r>
+              <w:rPr>
+                <w:sz w:val="22"/>
+              </w:rPr>
+              <w:t>Giao diện chat sau nâng cấp CSS: bố cục hai cột, khu vực phòng và hội thoại được làm mới</w:t>
+            </w:r>
+          </w:p>
+        </w:tc>
+        <w:tc>
+          <w:tcPr>
+            <w:tcW w:w="2256" w:type="dxa"/>
+            <w:shd w:val="clear" w:color="auto" w:fill="FAFAFA"/>
+            <w:tcMar>
+              <w:top w:w="120" w:type="dxa"/>
+              <w:left w:w="160" w:type="dxa"/>
+              <w:bottom w:w="120" w:type="dxa"/>
+              <w:right w:w="160" w:type="dxa"/>
+            </w:tcMar>
+          </w:tcPr>
+          <w:p>
+            <w:pPr>
+              <w:spacing w:before="40" w:after="40" w:line="276" w:lineRule="auto"/>
+            </w:pPr>
+            <w:r>
+              <w:rPr>
+                <w:sz w:val="22"/>
+              </w:rPr>
+              <w:t>UI mới</w:t>
+            </w:r>
+          </w:p>
+        </w:tc>
+        <w:tc>
+          <w:tcPr>
+            <w:tcW w:w="2256" w:type="dxa"/>
+            <w:shd w:val="clear" w:color="auto" w:fill="FAFAFA"/>
+            <w:tcMar>
+              <w:top w:w="120" w:type="dxa"/>
+              <w:left w:w="160" w:type="dxa"/>
+              <w:bottom w:w="120" w:type="dxa"/>
+              <w:right w:w="160" w:type="dxa"/>
+            </w:tcMar>
+          </w:tcPr>
+          <w:p>
+            <w:pPr>
+              <w:spacing w:before="40" w:after="40" w:line="276" w:lineRule="auto"/>
+            </w:pPr>
+            <w:r>
+              <w:rPr>
+                <w:sz w:val="22"/>
+              </w:rPr>
+              <w:t>Hình 9.1</w:t>
             </w:r>
           </w:p>
         </w:tc>
@@ -35541,7 +35263,7 @@
     <w:p>
       <w:pPr/>
       <w:r>
-        <w:t>Bảng dưới tổng hợp năm commit đã xác minh trên origin/main tại thời điểm lập báo cáo. Báo cáo này được bổ sung vào repository sau các commit được liệt kê.</w:t>
+        <w:t>Bảng dưới liệt kê bảy mốc commit đã xác minh trên origin/main đến commit nâng cấp giao diện 3451783. Bản báo cáo này được cập nhật sau thay đổi giao diện; lần đồng bộ tài liệu sẽ được ghi nhận bằng commit riêng.</w:t>
       </w:r>
     </w:p>
     <w:p>
@@ -36377,6 +36099,156 @@
               </w:rPr>
             </w:r>
             <w:proofErr w:type="spellEnd"/>
+          </w:p>
+        </w:tc>
+      </w:tr>
+      <w:tr>
+        <w:trPr>
+          <w:cantSplit/>
+          <w:jc w:val="center"/>
+        </w:trPr>
+        <w:tc>
+          <w:tcPr>
+            <w:tcW w:w="3009" w:type="dxa"/>
+            <w:shd w:val="clear" w:color="auto" w:fill="FAFAFA"/>
+            <w:tcMar>
+              <w:top w:w="120" w:type="dxa"/>
+              <w:left w:w="160" w:type="dxa"/>
+              <w:bottom w:w="120" w:type="dxa"/>
+              <w:right w:w="160" w:type="dxa"/>
+            </w:tcMar>
+          </w:tcPr>
+          <w:p>
+            <w:pPr>
+              <w:spacing w:before="40" w:after="40" w:line="276" w:lineRule="auto"/>
+            </w:pPr>
+            <w:r>
+              <w:rPr>
+                <w:sz w:val="22"/>
+              </w:rPr>
+              <w:t>cf9d85a</w:t>
+            </w:r>
+          </w:p>
+        </w:tc>
+        <w:tc>
+          <w:tcPr>
+            <w:tcW w:w="3009" w:type="dxa"/>
+            <w:shd w:val="clear" w:color="auto" w:fill="FAFAFA"/>
+            <w:tcMar>
+              <w:top w:w="120" w:type="dxa"/>
+              <w:left w:w="160" w:type="dxa"/>
+              <w:bottom w:w="120" w:type="dxa"/>
+              <w:right w:w="160" w:type="dxa"/>
+            </w:tcMar>
+          </w:tcPr>
+          <w:p>
+            <w:pPr>
+              <w:spacing w:before="40" w:after="40" w:line="276" w:lineRule="auto"/>
+            </w:pPr>
+            <w:r>
+              <w:rPr>
+                <w:sz w:val="22"/>
+              </w:rPr>
+              <w:t>Add finalized Vietnamese practical report</w:t>
+            </w:r>
+          </w:p>
+        </w:tc>
+        <w:tc>
+          <w:tcPr>
+            <w:tcW w:w="3009" w:type="dxa"/>
+            <w:shd w:val="clear" w:color="auto" w:fill="FAFAFA"/>
+            <w:tcMar>
+              <w:top w:w="120" w:type="dxa"/>
+              <w:left w:w="160" w:type="dxa"/>
+              <w:bottom w:w="120" w:type="dxa"/>
+              <w:right w:w="160" w:type="dxa"/>
+            </w:tcMar>
+          </w:tcPr>
+          <w:p>
+            <w:pPr>
+              <w:spacing w:before="40" w:after="40" w:line="276" w:lineRule="auto"/>
+            </w:pPr>
+            <w:r>
+              <w:rPr>
+                <w:sz w:val="22"/>
+              </w:rPr>
+              <w:t>Bổ sung báo cáo Word đã hiệu chỉnh</w:t>
+            </w:r>
+          </w:p>
+        </w:tc>
+      </w:tr>
+      <w:tr>
+        <w:trPr>
+          <w:cantSplit/>
+          <w:jc w:val="center"/>
+        </w:trPr>
+        <w:tc>
+          <w:tcPr>
+            <w:tcW w:w="3009" w:type="dxa"/>
+            <w:shd w:val="clear" w:color="auto" w:fill="FAFAFA"/>
+            <w:tcMar>
+              <w:top w:w="120" w:type="dxa"/>
+              <w:left w:w="160" w:type="dxa"/>
+              <w:bottom w:w="120" w:type="dxa"/>
+              <w:right w:w="160" w:type="dxa"/>
+            </w:tcMar>
+          </w:tcPr>
+          <w:p>
+            <w:pPr>
+              <w:spacing w:before="40" w:after="40" w:line="276" w:lineRule="auto"/>
+            </w:pPr>
+            <w:r>
+              <w:rPr>
+                <w:sz w:val="22"/>
+              </w:rPr>
+              <w:t>3451783</w:t>
+            </w:r>
+          </w:p>
+        </w:tc>
+        <w:tc>
+          <w:tcPr>
+            <w:tcW w:w="3009" w:type="dxa"/>
+            <w:shd w:val="clear" w:color="auto" w:fill="FAFAFA"/>
+            <w:tcMar>
+              <w:top w:w="120" w:type="dxa"/>
+              <w:left w:w="160" w:type="dxa"/>
+              <w:bottom w:w="120" w:type="dxa"/>
+              <w:right w:w="160" w:type="dxa"/>
+            </w:tcMar>
+          </w:tcPr>
+          <w:p>
+            <w:pPr>
+              <w:spacing w:before="40" w:after="40" w:line="276" w:lineRule="auto"/>
+            </w:pPr>
+            <w:r>
+              <w:rPr>
+                <w:sz w:val="22"/>
+              </w:rPr>
+              <w:t>Refresh chat UI styling</w:t>
+            </w:r>
+          </w:p>
+        </w:tc>
+        <w:tc>
+          <w:tcPr>
+            <w:tcW w:w="3009" w:type="dxa"/>
+            <w:shd w:val="clear" w:color="auto" w:fill="FAFAFA"/>
+            <w:tcMar>
+              <w:top w:w="120" w:type="dxa"/>
+              <w:left w:w="160" w:type="dxa"/>
+              <w:bottom w:w="120" w:type="dxa"/>
+              <w:right w:w="160" w:type="dxa"/>
+            </w:tcMar>
+          </w:tcPr>
+          <w:p>
+            <w:pPr>
+              <w:spacing w:before="40" w:after="40" w:line="276" w:lineRule="auto"/>
+            </w:pPr>
+            <w:r>
+              <w:rPr>
+                <w:sz w:val="22"/>
+              </w:rPr>
+              <w:t>Nâng cấp CSS giao diện chat và thêm ảnh minh chứng</w:t>
+            </w:r>
           </w:p>
         </w:tc>
       </w:tr>

</xml_diff>